<commit_message>
Add second report author and faculty name
</commit_message>
<xml_diff>
--- a/docs/GitOps_Case_Study_Project_Report.docx
+++ b/docs/GitOps_Case_Study_Project_Report.docx
@@ -108,6 +108,7 @@
     </w:p>
     <w:p>
       <w:pPr>
+        <w:spacing w:line="240" w:lineRule="auto"/>
         <w:jc w:val="center"/>
         <w:rPr>
           <w:rFonts w:cs="Times New Roman"/>
@@ -126,6 +127,7 @@
     </w:p>
     <w:p>
       <w:pPr>
+        <w:spacing w:line="240" w:lineRule="auto"/>
         <w:jc w:val="center"/>
         <w:rPr>
           <w:rFonts w:cs="Times New Roman"/>
@@ -147,6 +149,7 @@
     </w:p>
     <w:p>
       <w:pPr>
+        <w:spacing w:line="240" w:lineRule="auto"/>
         <w:jc w:val="center"/>
       </w:pPr>
       <w:r>
@@ -159,6 +162,7 @@
     </w:p>
     <w:p>
       <w:pPr>
+        <w:spacing w:line="240" w:lineRule="auto"/>
         <w:jc w:val="center"/>
       </w:pPr>
       <w:r>
@@ -171,6 +175,7 @@
     </w:p>
     <w:p>
       <w:pPr>
+        <w:spacing w:line="240" w:lineRule="auto"/>
         <w:jc w:val="center"/>
       </w:pPr>
       <w:r>
@@ -188,6 +193,7 @@
     </w:p>
     <w:p>
       <w:pPr>
+        <w:spacing w:line="240" w:lineRule="auto"/>
         <w:jc w:val="center"/>
       </w:pPr>
       <w:r>
@@ -199,6 +205,7 @@
     </w:p>
     <w:p>
       <w:pPr>
+        <w:spacing w:line="240" w:lineRule="auto"/>
         <w:jc w:val="center"/>
       </w:pPr>
       <w:r>
@@ -208,9 +215,18 @@
         </w:rPr>
         <w:t>Pallab Das</w:t>
       </w:r>
-    </w:p>
-    <w:p>
-      <w:pPr>
+      <w:r>
+        <w:rPr>
+          <w:b/>
+          <w:sz w:val="28"/>
+        </w:rPr>
+        <w:br/>
+        <w:t>Vaibhav Kumar</w:t>
+      </w:r>
+    </w:p>
+    <w:p>
+      <w:pPr>
+        <w:spacing w:line="240" w:lineRule="auto"/>
         <w:jc w:val="center"/>
       </w:pPr>
       <w:r>
@@ -219,14 +235,22 @@
         </w:rPr>
         <w:t>24MIS0212</w:t>
       </w:r>
-    </w:p>
-    <w:p>
-      <w:r>
+      <w:r>
+        <w:rPr>
+          <w:sz w:val="28"/>
+        </w:rPr>
         <w:br/>
-      </w:r>
-    </w:p>
-    <w:p>
-      <w:pPr>
+        <w:t>24MIS0476</w:t>
+      </w:r>
+    </w:p>
+    <w:p>
+      <w:r>
+        <w:br/>
+      </w:r>
+    </w:p>
+    <w:p>
+      <w:pPr>
+        <w:spacing w:line="240" w:lineRule="auto"/>
         <w:jc w:val="center"/>
       </w:pPr>
       <w:r>
@@ -238,6 +262,7 @@
     </w:p>
     <w:p>
       <w:pPr>
+        <w:spacing w:line="240" w:lineRule="auto"/>
         <w:jc w:val="center"/>
       </w:pPr>
       <w:r>
@@ -245,7 +270,7 @@
           <w:b/>
           <w:sz w:val="28"/>
         </w:rPr>
-        <w:t>SCM Course Faculty</w:t>
+        <w:t>KARTHIKEYAN D</w:t>
       </w:r>
     </w:p>
     <w:p>
@@ -258,6 +283,7 @@
     </w:p>
     <w:p>
       <w:pPr>
+        <w:spacing w:line="240" w:lineRule="auto"/>
         <w:jc w:val="center"/>
       </w:pPr>
       <w:r>
@@ -269,6 +295,7 @@
     </w:p>
     <w:p>
       <w:pPr>
+        <w:spacing w:line="240" w:lineRule="auto"/>
         <w:jc w:val="center"/>
       </w:pPr>
       <w:r>
@@ -289,6 +316,7 @@
     </w:p>
     <w:p>
       <w:pPr>
+        <w:spacing w:line="240" w:lineRule="auto"/>
         <w:jc w:val="center"/>
       </w:pPr>
       <w:r>
@@ -304,7 +332,7 @@
         <w:pStyle w:val="Heading1"/>
         <w:pageBreakBefore/>
       </w:pPr>
-      <w:bookmarkStart w:id="0" w:name="_Toc243423884"/>
+      <w:bookmarkStart w:id="0" w:name="_Toc243424954"/>
       <w:r>
         <w:rPr>
           <w:rFonts w:ascii="Times New Roman" w:eastAsia="Times New Roman" w:hAnsi="Times New Roman"/>
@@ -334,7 +362,7 @@
       <w:pPr>
         <w:pStyle w:val="Heading1"/>
       </w:pPr>
-      <w:bookmarkStart w:id="1" w:name="_Toc243423885"/>
+      <w:bookmarkStart w:id="1" w:name="_Toc243424955"/>
       <w:r>
         <w:rPr>
           <w:rFonts w:ascii="Times New Roman" w:eastAsia="Times New Roman" w:hAnsi="Times New Roman"/>
@@ -362,7 +390,7 @@
       <w:r>
         <w:fldChar w:fldCharType="separate"/>
       </w:r>
-      <w:hyperlink w:anchor="_Toc243423884" w:history="1">
+      <w:hyperlink w:anchor="_Toc243424954" w:history="1">
         <w:r>
           <w:rPr>
             <w:rStyle w:val="Hyperlink"/>
@@ -389,7 +417,7 @@
             <w:noProof/>
             <w:webHidden/>
           </w:rPr>
-          <w:instrText xml:space="preserve"> PAGEREF _Toc243423884 \h </w:instrText>
+          <w:instrText xml:space="preserve"> PAGEREF _Toc243424954 \h </w:instrText>
         </w:r>
         <w:r>
           <w:rPr>
@@ -430,7 +458,7 @@
           <w:noProof/>
         </w:rPr>
       </w:pPr>
-      <w:hyperlink w:anchor="_Toc243423885" w:history="1">
+      <w:hyperlink w:anchor="_Toc243424955" w:history="1">
         <w:r>
           <w:rPr>
             <w:rStyle w:val="Hyperlink"/>
@@ -457,7 +485,7 @@
             <w:noProof/>
             <w:webHidden/>
           </w:rPr>
-          <w:instrText xml:space="preserve"> PAGEREF _Toc243423885 \h </w:instrText>
+          <w:instrText xml:space="preserve"> PAGEREF _Toc243424955 \h </w:instrText>
         </w:r>
         <w:r>
           <w:rPr>
@@ -498,7 +526,7 @@
           <w:noProof/>
         </w:rPr>
       </w:pPr>
-      <w:hyperlink w:anchor="_Toc243423886" w:history="1">
+      <w:hyperlink w:anchor="_Toc243424956" w:history="1">
         <w:r>
           <w:rPr>
             <w:rStyle w:val="Hyperlink"/>
@@ -525,7 +553,7 @@
             <w:noProof/>
             <w:webHidden/>
           </w:rPr>
-          <w:instrText xml:space="preserve"> PAGEREF _Toc243423886 \h </w:instrText>
+          <w:instrText xml:space="preserve"> PAGEREF _Toc243424956 \h </w:instrText>
         </w:r>
         <w:r>
           <w:rPr>
@@ -566,7 +594,7 @@
           <w:noProof/>
         </w:rPr>
       </w:pPr>
-      <w:hyperlink w:anchor="_Toc243423887" w:history="1">
+      <w:hyperlink w:anchor="_Toc243424957" w:history="1">
         <w:r>
           <w:rPr>
             <w:rStyle w:val="Hyperlink"/>
@@ -593,7 +621,7 @@
             <w:noProof/>
             <w:webHidden/>
           </w:rPr>
-          <w:instrText xml:space="preserve"> PAGEREF _Toc243423887 \h </w:instrText>
+          <w:instrText xml:space="preserve"> PAGEREF _Toc243424957 \h </w:instrText>
         </w:r>
         <w:r>
           <w:rPr>
@@ -634,7 +662,7 @@
           <w:noProof/>
         </w:rPr>
       </w:pPr>
-      <w:hyperlink w:anchor="_Toc243423888" w:history="1">
+      <w:hyperlink w:anchor="_Toc243424958" w:history="1">
         <w:r>
           <w:rPr>
             <w:rStyle w:val="Hyperlink"/>
@@ -661,7 +689,7 @@
             <w:noProof/>
             <w:webHidden/>
           </w:rPr>
-          <w:instrText xml:space="preserve"> PAGEREF _Toc243423888 \h </w:instrText>
+          <w:instrText xml:space="preserve"> PAGEREF _Toc243424958 \h </w:instrText>
         </w:r>
         <w:r>
           <w:rPr>
@@ -702,7 +730,7 @@
           <w:noProof/>
         </w:rPr>
       </w:pPr>
-      <w:hyperlink w:anchor="_Toc243423889" w:history="1">
+      <w:hyperlink w:anchor="_Toc243424959" w:history="1">
         <w:r>
           <w:rPr>
             <w:rStyle w:val="Hyperlink"/>
@@ -729,7 +757,7 @@
             <w:noProof/>
             <w:webHidden/>
           </w:rPr>
-          <w:instrText xml:space="preserve"> PAGEREF _Toc243423889 \h </w:instrText>
+          <w:instrText xml:space="preserve"> PAGEREF _Toc243424959 \h </w:instrText>
         </w:r>
         <w:r>
           <w:rPr>
@@ -770,7 +798,7 @@
           <w:noProof/>
         </w:rPr>
       </w:pPr>
-      <w:hyperlink w:anchor="_Toc243423890" w:history="1">
+      <w:hyperlink w:anchor="_Toc243424960" w:history="1">
         <w:r>
           <w:rPr>
             <w:rStyle w:val="Hyperlink"/>
@@ -797,7 +825,7 @@
             <w:noProof/>
             <w:webHidden/>
           </w:rPr>
-          <w:instrText xml:space="preserve"> PAGEREF _Toc243423890 \h </w:instrText>
+          <w:instrText xml:space="preserve"> PAGEREF _Toc243424960 \h </w:instrText>
         </w:r>
         <w:r>
           <w:rPr>
@@ -838,7 +866,7 @@
           <w:noProof/>
         </w:rPr>
       </w:pPr>
-      <w:hyperlink w:anchor="_Toc243423891" w:history="1">
+      <w:hyperlink w:anchor="_Toc243424961" w:history="1">
         <w:r>
           <w:rPr>
             <w:rStyle w:val="Hyperlink"/>
@@ -865,7 +893,7 @@
             <w:noProof/>
             <w:webHidden/>
           </w:rPr>
-          <w:instrText xml:space="preserve"> PAGEREF _Toc243423891 \h </w:instrText>
+          <w:instrText xml:space="preserve"> PAGEREF _Toc243424961 \h </w:instrText>
         </w:r>
         <w:r>
           <w:rPr>
@@ -906,7 +934,7 @@
           <w:noProof/>
         </w:rPr>
       </w:pPr>
-      <w:hyperlink w:anchor="_Toc243423892" w:history="1">
+      <w:hyperlink w:anchor="_Toc243424962" w:history="1">
         <w:r>
           <w:rPr>
             <w:rStyle w:val="Hyperlink"/>
@@ -933,7 +961,7 @@
             <w:noProof/>
             <w:webHidden/>
           </w:rPr>
-          <w:instrText xml:space="preserve"> PAGEREF _Toc243423892 \h </w:instrText>
+          <w:instrText xml:space="preserve"> PAGEREF _Toc243424962 \h </w:instrText>
         </w:r>
         <w:r>
           <w:rPr>
@@ -974,7 +1002,7 @@
           <w:noProof/>
         </w:rPr>
       </w:pPr>
-      <w:hyperlink w:anchor="_Toc243423893" w:history="1">
+      <w:hyperlink w:anchor="_Toc243424963" w:history="1">
         <w:r>
           <w:rPr>
             <w:rStyle w:val="Hyperlink"/>
@@ -1001,7 +1029,7 @@
             <w:noProof/>
             <w:webHidden/>
           </w:rPr>
-          <w:instrText xml:space="preserve"> PAGEREF _Toc243423893 \h </w:instrText>
+          <w:instrText xml:space="preserve"> PAGEREF _Toc243424963 \h </w:instrText>
         </w:r>
         <w:r>
           <w:rPr>
@@ -1042,7 +1070,7 @@
           <w:noProof/>
         </w:rPr>
       </w:pPr>
-      <w:hyperlink w:anchor="_Toc243423894" w:history="1">
+      <w:hyperlink w:anchor="_Toc243424964" w:history="1">
         <w:r>
           <w:rPr>
             <w:rStyle w:val="Hyperlink"/>
@@ -1069,7 +1097,7 @@
             <w:noProof/>
             <w:webHidden/>
           </w:rPr>
-          <w:instrText xml:space="preserve"> PAGEREF _Toc243423894 \h </w:instrText>
+          <w:instrText xml:space="preserve"> PAGEREF _Toc243424964 \h </w:instrText>
         </w:r>
         <w:r>
           <w:rPr>
@@ -1110,7 +1138,7 @@
           <w:noProof/>
         </w:rPr>
       </w:pPr>
-      <w:hyperlink w:anchor="_Toc243423895" w:history="1">
+      <w:hyperlink w:anchor="_Toc243424965" w:history="1">
         <w:r>
           <w:rPr>
             <w:rStyle w:val="Hyperlink"/>
@@ -1137,7 +1165,7 @@
             <w:noProof/>
             <w:webHidden/>
           </w:rPr>
-          <w:instrText xml:space="preserve"> PAGEREF _Toc243423895 \h </w:instrText>
+          <w:instrText xml:space="preserve"> PAGEREF _Toc243424965 \h </w:instrText>
         </w:r>
         <w:r>
           <w:rPr>
@@ -1178,7 +1206,7 @@
           <w:noProof/>
         </w:rPr>
       </w:pPr>
-      <w:hyperlink w:anchor="_Toc243423896" w:history="1">
+      <w:hyperlink w:anchor="_Toc243424966" w:history="1">
         <w:r>
           <w:rPr>
             <w:rStyle w:val="Hyperlink"/>
@@ -1205,7 +1233,7 @@
             <w:noProof/>
             <w:webHidden/>
           </w:rPr>
-          <w:instrText xml:space="preserve"> PAGEREF _Toc243423896 \h </w:instrText>
+          <w:instrText xml:space="preserve"> PAGEREF _Toc243424966 \h </w:instrText>
         </w:r>
         <w:r>
           <w:rPr>
@@ -1246,7 +1274,7 @@
           <w:noProof/>
         </w:rPr>
       </w:pPr>
-      <w:hyperlink w:anchor="_Toc243423897" w:history="1">
+      <w:hyperlink w:anchor="_Toc243424967" w:history="1">
         <w:r>
           <w:rPr>
             <w:rStyle w:val="Hyperlink"/>
@@ -1273,7 +1301,7 @@
             <w:noProof/>
             <w:webHidden/>
           </w:rPr>
-          <w:instrText xml:space="preserve"> PAGEREF _Toc243423897 \h </w:instrText>
+          <w:instrText xml:space="preserve"> PAGEREF _Toc243424967 \h </w:instrText>
         </w:r>
         <w:r>
           <w:rPr>
@@ -1314,7 +1342,7 @@
           <w:noProof/>
         </w:rPr>
       </w:pPr>
-      <w:hyperlink w:anchor="_Toc243423898" w:history="1">
+      <w:hyperlink w:anchor="_Toc243424968" w:history="1">
         <w:r>
           <w:rPr>
             <w:rStyle w:val="Hyperlink"/>
@@ -1341,7 +1369,7 @@
             <w:noProof/>
             <w:webHidden/>
           </w:rPr>
-          <w:instrText xml:space="preserve"> PAGEREF _Toc243423898 \h </w:instrText>
+          <w:instrText xml:space="preserve"> PAGEREF _Toc243424968 \h </w:instrText>
         </w:r>
         <w:r>
           <w:rPr>
@@ -1382,7 +1410,7 @@
           <w:noProof/>
         </w:rPr>
       </w:pPr>
-      <w:hyperlink w:anchor="_Toc243423899" w:history="1">
+      <w:hyperlink w:anchor="_Toc243424969" w:history="1">
         <w:r>
           <w:rPr>
             <w:rStyle w:val="Hyperlink"/>
@@ -1409,7 +1437,7 @@
             <w:noProof/>
             <w:webHidden/>
           </w:rPr>
-          <w:instrText xml:space="preserve"> PAGEREF _Toc243423899 \h </w:instrText>
+          <w:instrText xml:space="preserve"> PAGEREF _Toc243424969 \h </w:instrText>
         </w:r>
         <w:r>
           <w:rPr>
@@ -1450,7 +1478,7 @@
           <w:noProof/>
         </w:rPr>
       </w:pPr>
-      <w:hyperlink w:anchor="_Toc243423900" w:history="1">
+      <w:hyperlink w:anchor="_Toc243424970" w:history="1">
         <w:r>
           <w:rPr>
             <w:rStyle w:val="Hyperlink"/>
@@ -1477,7 +1505,7 @@
             <w:noProof/>
             <w:webHidden/>
           </w:rPr>
-          <w:instrText xml:space="preserve"> PAGEREF _Toc243423900 \h </w:instrText>
+          <w:instrText xml:space="preserve"> PAGEREF _Toc243424970 \h </w:instrText>
         </w:r>
         <w:r>
           <w:rPr>
@@ -1518,7 +1546,7 @@
           <w:noProof/>
         </w:rPr>
       </w:pPr>
-      <w:hyperlink w:anchor="_Toc243423901" w:history="1">
+      <w:hyperlink w:anchor="_Toc243424971" w:history="1">
         <w:r>
           <w:rPr>
             <w:rStyle w:val="Hyperlink"/>
@@ -1545,7 +1573,7 @@
             <w:noProof/>
             <w:webHidden/>
           </w:rPr>
-          <w:instrText xml:space="preserve"> PAGEREF _Toc243423901 \h </w:instrText>
+          <w:instrText xml:space="preserve"> PAGEREF _Toc243424971 \h </w:instrText>
         </w:r>
         <w:r>
           <w:rPr>
@@ -1586,7 +1614,7 @@
           <w:noProof/>
         </w:rPr>
       </w:pPr>
-      <w:hyperlink w:anchor="_Toc243423902" w:history="1">
+      <w:hyperlink w:anchor="_Toc243424972" w:history="1">
         <w:r>
           <w:rPr>
             <w:rStyle w:val="Hyperlink"/>
@@ -1613,7 +1641,7 @@
             <w:noProof/>
             <w:webHidden/>
           </w:rPr>
-          <w:instrText xml:space="preserve"> PAGEREF _Toc243423902 \h </w:instrText>
+          <w:instrText xml:space="preserve"> PAGEREF _Toc243424972 \h </w:instrText>
         </w:r>
         <w:r>
           <w:rPr>
@@ -1654,7 +1682,7 @@
           <w:noProof/>
         </w:rPr>
       </w:pPr>
-      <w:hyperlink w:anchor="_Toc243423903" w:history="1">
+      <w:hyperlink w:anchor="_Toc243424973" w:history="1">
         <w:r>
           <w:rPr>
             <w:rStyle w:val="Hyperlink"/>
@@ -1681,7 +1709,7 @@
             <w:noProof/>
             <w:webHidden/>
           </w:rPr>
-          <w:instrText xml:space="preserve"> PAGEREF _Toc243423903 \h </w:instrText>
+          <w:instrText xml:space="preserve"> PAGEREF _Toc243424973 \h </w:instrText>
         </w:r>
         <w:r>
           <w:rPr>
@@ -1722,7 +1750,7 @@
           <w:noProof/>
         </w:rPr>
       </w:pPr>
-      <w:hyperlink w:anchor="_Toc243423904" w:history="1">
+      <w:hyperlink w:anchor="_Toc243424974" w:history="1">
         <w:r>
           <w:rPr>
             <w:rStyle w:val="Hyperlink"/>
@@ -1749,7 +1777,7 @@
             <w:noProof/>
             <w:webHidden/>
           </w:rPr>
-          <w:instrText xml:space="preserve"> PAGEREF _Toc243423904 \h </w:instrText>
+          <w:instrText xml:space="preserve"> PAGEREF _Toc243424974 \h </w:instrText>
         </w:r>
         <w:r>
           <w:rPr>
@@ -1790,7 +1818,7 @@
           <w:noProof/>
         </w:rPr>
       </w:pPr>
-      <w:hyperlink w:anchor="_Toc243423905" w:history="1">
+      <w:hyperlink w:anchor="_Toc243424975" w:history="1">
         <w:r>
           <w:rPr>
             <w:rStyle w:val="Hyperlink"/>
@@ -1817,7 +1845,7 @@
             <w:noProof/>
             <w:webHidden/>
           </w:rPr>
-          <w:instrText xml:space="preserve"> PAGEREF _Toc243423905 \h </w:instrText>
+          <w:instrText xml:space="preserve"> PAGEREF _Toc243424975 \h </w:instrText>
         </w:r>
         <w:r>
           <w:rPr>
@@ -1858,7 +1886,7 @@
           <w:noProof/>
         </w:rPr>
       </w:pPr>
-      <w:hyperlink w:anchor="_Toc243423906" w:history="1">
+      <w:hyperlink w:anchor="_Toc243424976" w:history="1">
         <w:r>
           <w:rPr>
             <w:rStyle w:val="Hyperlink"/>
@@ -1885,7 +1913,7 @@
             <w:noProof/>
             <w:webHidden/>
           </w:rPr>
-          <w:instrText xml:space="preserve"> PAGEREF _Toc243423906 \h </w:instrText>
+          <w:instrText xml:space="preserve"> PAGEREF _Toc243424976 \h </w:instrText>
         </w:r>
         <w:r>
           <w:rPr>
@@ -1926,7 +1954,7 @@
           <w:noProof/>
         </w:rPr>
       </w:pPr>
-      <w:hyperlink w:anchor="_Toc243423907" w:history="1">
+      <w:hyperlink w:anchor="_Toc243424977" w:history="1">
         <w:r>
           <w:rPr>
             <w:rStyle w:val="Hyperlink"/>
@@ -1953,7 +1981,7 @@
             <w:noProof/>
             <w:webHidden/>
           </w:rPr>
-          <w:instrText xml:space="preserve"> PAGEREF _Toc243423907 \h </w:instrText>
+          <w:instrText xml:space="preserve"> PAGEREF _Toc243424977 \h </w:instrText>
         </w:r>
         <w:r>
           <w:rPr>
@@ -1994,7 +2022,7 @@
           <w:noProof/>
         </w:rPr>
       </w:pPr>
-      <w:hyperlink w:anchor="_Toc243423908" w:history="1">
+      <w:hyperlink w:anchor="_Toc243424978" w:history="1">
         <w:r>
           <w:rPr>
             <w:rStyle w:val="Hyperlink"/>
@@ -2021,7 +2049,7 @@
             <w:noProof/>
             <w:webHidden/>
           </w:rPr>
-          <w:instrText xml:space="preserve"> PAGEREF _Toc243423908 \h </w:instrText>
+          <w:instrText xml:space="preserve"> PAGEREF _Toc243424978 \h </w:instrText>
         </w:r>
         <w:r>
           <w:rPr>
@@ -2062,7 +2090,7 @@
           <w:noProof/>
         </w:rPr>
       </w:pPr>
-      <w:hyperlink w:anchor="_Toc243423909" w:history="1">
+      <w:hyperlink w:anchor="_Toc243424979" w:history="1">
         <w:r>
           <w:rPr>
             <w:rStyle w:val="Hyperlink"/>
@@ -2089,7 +2117,7 @@
             <w:noProof/>
             <w:webHidden/>
           </w:rPr>
-          <w:instrText xml:space="preserve"> PAGEREF _Toc243423909 \h </w:instrText>
+          <w:instrText xml:space="preserve"> PAGEREF _Toc243424979 \h </w:instrText>
         </w:r>
         <w:r>
           <w:rPr>
@@ -2130,7 +2158,7 @@
           <w:noProof/>
         </w:rPr>
       </w:pPr>
-      <w:hyperlink w:anchor="_Toc243423910" w:history="1">
+      <w:hyperlink w:anchor="_Toc243424980" w:history="1">
         <w:r>
           <w:rPr>
             <w:rStyle w:val="Hyperlink"/>
@@ -2157,7 +2185,7 @@
             <w:noProof/>
             <w:webHidden/>
           </w:rPr>
-          <w:instrText xml:space="preserve"> PAGEREF _Toc243423910 \h </w:instrText>
+          <w:instrText xml:space="preserve"> PAGEREF _Toc243424980 \h </w:instrText>
         </w:r>
         <w:r>
           <w:rPr>
@@ -2198,7 +2226,7 @@
           <w:noProof/>
         </w:rPr>
       </w:pPr>
-      <w:hyperlink w:anchor="_Toc243423911" w:history="1">
+      <w:hyperlink w:anchor="_Toc243424981" w:history="1">
         <w:r>
           <w:rPr>
             <w:rStyle w:val="Hyperlink"/>
@@ -2225,7 +2253,7 @@
             <w:noProof/>
             <w:webHidden/>
           </w:rPr>
-          <w:instrText xml:space="preserve"> PAGEREF _Toc243423911 \h </w:instrText>
+          <w:instrText xml:space="preserve"> PAGEREF _Toc243424981 \h </w:instrText>
         </w:r>
         <w:r>
           <w:rPr>
@@ -2266,7 +2294,7 @@
           <w:noProof/>
         </w:rPr>
       </w:pPr>
-      <w:hyperlink w:anchor="_Toc243423912" w:history="1">
+      <w:hyperlink w:anchor="_Toc243424982" w:history="1">
         <w:r>
           <w:rPr>
             <w:rStyle w:val="Hyperlink"/>
@@ -2293,7 +2321,7 @@
             <w:noProof/>
             <w:webHidden/>
           </w:rPr>
-          <w:instrText xml:space="preserve"> PAGEREF _Toc243423912 \h </w:instrText>
+          <w:instrText xml:space="preserve"> PAGEREF _Toc243424982 \h </w:instrText>
         </w:r>
         <w:r>
           <w:rPr>
@@ -2334,7 +2362,7 @@
           <w:noProof/>
         </w:rPr>
       </w:pPr>
-      <w:hyperlink w:anchor="_Toc243423913" w:history="1">
+      <w:hyperlink w:anchor="_Toc243424983" w:history="1">
         <w:r>
           <w:rPr>
             <w:rStyle w:val="Hyperlink"/>
@@ -2361,7 +2389,7 @@
             <w:noProof/>
             <w:webHidden/>
           </w:rPr>
-          <w:instrText xml:space="preserve"> PAGEREF _Toc243423913 \h </w:instrText>
+          <w:instrText xml:space="preserve"> PAGEREF _Toc243424983 \h </w:instrText>
         </w:r>
         <w:r>
           <w:rPr>
@@ -2402,7 +2430,7 @@
           <w:noProof/>
         </w:rPr>
       </w:pPr>
-      <w:hyperlink w:anchor="_Toc243423914" w:history="1">
+      <w:hyperlink w:anchor="_Toc243424984" w:history="1">
         <w:r>
           <w:rPr>
             <w:rStyle w:val="Hyperlink"/>
@@ -2429,7 +2457,7 @@
             <w:noProof/>
             <w:webHidden/>
           </w:rPr>
-          <w:instrText xml:space="preserve"> PAGEREF _Toc243423914 \h </w:instrText>
+          <w:instrText xml:space="preserve"> PAGEREF _Toc243424984 \h </w:instrText>
         </w:r>
         <w:r>
           <w:rPr>
@@ -2470,7 +2498,7 @@
           <w:noProof/>
         </w:rPr>
       </w:pPr>
-      <w:hyperlink w:anchor="_Toc243423915" w:history="1">
+      <w:hyperlink w:anchor="_Toc243424985" w:history="1">
         <w:r>
           <w:rPr>
             <w:rStyle w:val="Hyperlink"/>
@@ -2497,7 +2525,7 @@
             <w:noProof/>
             <w:webHidden/>
           </w:rPr>
-          <w:instrText xml:space="preserve"> PAGEREF _Toc243423915 \h </w:instrText>
+          <w:instrText xml:space="preserve"> PAGEREF _Toc243424985 \h </w:instrText>
         </w:r>
         <w:r>
           <w:rPr>
@@ -2538,7 +2566,7 @@
           <w:noProof/>
         </w:rPr>
       </w:pPr>
-      <w:hyperlink w:anchor="_Toc243423916" w:history="1">
+      <w:hyperlink w:anchor="_Toc243424986" w:history="1">
         <w:r>
           <w:rPr>
             <w:rStyle w:val="Hyperlink"/>
@@ -2565,7 +2593,7 @@
             <w:noProof/>
             <w:webHidden/>
           </w:rPr>
-          <w:instrText xml:space="preserve"> PAGEREF _Toc243423916 \h </w:instrText>
+          <w:instrText xml:space="preserve"> PAGEREF _Toc243424986 \h </w:instrText>
         </w:r>
         <w:r>
           <w:rPr>
@@ -2606,7 +2634,7 @@
           <w:noProof/>
         </w:rPr>
       </w:pPr>
-      <w:hyperlink w:anchor="_Toc243423917" w:history="1">
+      <w:hyperlink w:anchor="_Toc243424987" w:history="1">
         <w:r>
           <w:rPr>
             <w:rStyle w:val="Hyperlink"/>
@@ -2633,7 +2661,7 @@
             <w:noProof/>
             <w:webHidden/>
           </w:rPr>
-          <w:instrText xml:space="preserve"> PAGEREF _Toc243423917 \h </w:instrText>
+          <w:instrText xml:space="preserve"> PAGEREF _Toc243424987 \h </w:instrText>
         </w:r>
         <w:r>
           <w:rPr>
@@ -2674,7 +2702,7 @@
           <w:noProof/>
         </w:rPr>
       </w:pPr>
-      <w:hyperlink w:anchor="_Toc243423918" w:history="1">
+      <w:hyperlink w:anchor="_Toc243424988" w:history="1">
         <w:r>
           <w:rPr>
             <w:rStyle w:val="Hyperlink"/>
@@ -2701,7 +2729,7 @@
             <w:noProof/>
             <w:webHidden/>
           </w:rPr>
-          <w:instrText xml:space="preserve"> PAGEREF _Toc243423918 \h </w:instrText>
+          <w:instrText xml:space="preserve"> PAGEREF _Toc243424988 \h </w:instrText>
         </w:r>
         <w:r>
           <w:rPr>
@@ -2742,7 +2770,7 @@
           <w:noProof/>
         </w:rPr>
       </w:pPr>
-      <w:hyperlink w:anchor="_Toc243423919" w:history="1">
+      <w:hyperlink w:anchor="_Toc243424989" w:history="1">
         <w:r>
           <w:rPr>
             <w:rStyle w:val="Hyperlink"/>
@@ -2769,7 +2797,7 @@
             <w:noProof/>
             <w:webHidden/>
           </w:rPr>
-          <w:instrText xml:space="preserve"> PAGEREF _Toc243423919 \h </w:instrText>
+          <w:instrText xml:space="preserve"> PAGEREF _Toc243424989 \h </w:instrText>
         </w:r>
         <w:r>
           <w:rPr>
@@ -2810,7 +2838,7 @@
           <w:noProof/>
         </w:rPr>
       </w:pPr>
-      <w:hyperlink w:anchor="_Toc243423920" w:history="1">
+      <w:hyperlink w:anchor="_Toc243424990" w:history="1">
         <w:r>
           <w:rPr>
             <w:rStyle w:val="Hyperlink"/>
@@ -2837,7 +2865,7 @@
             <w:noProof/>
             <w:webHidden/>
           </w:rPr>
-          <w:instrText xml:space="preserve"> PAGEREF _Toc243423920 \h </w:instrText>
+          <w:instrText xml:space="preserve"> PAGEREF _Toc243424990 \h </w:instrText>
         </w:r>
         <w:r>
           <w:rPr>
@@ -2878,7 +2906,7 @@
           <w:noProof/>
         </w:rPr>
       </w:pPr>
-      <w:hyperlink w:anchor="_Toc243423921" w:history="1">
+      <w:hyperlink w:anchor="_Toc243424991" w:history="1">
         <w:r>
           <w:rPr>
             <w:rStyle w:val="Hyperlink"/>
@@ -2905,7 +2933,7 @@
             <w:noProof/>
             <w:webHidden/>
           </w:rPr>
-          <w:instrText xml:space="preserve"> PAGEREF _Toc243423921 \h </w:instrText>
+          <w:instrText xml:space="preserve"> PAGEREF _Toc243424991 \h </w:instrText>
         </w:r>
         <w:r>
           <w:rPr>
@@ -2946,7 +2974,7 @@
           <w:noProof/>
         </w:rPr>
       </w:pPr>
-      <w:hyperlink w:anchor="_Toc243423922" w:history="1">
+      <w:hyperlink w:anchor="_Toc243424992" w:history="1">
         <w:r>
           <w:rPr>
             <w:rStyle w:val="Hyperlink"/>
@@ -2973,7 +3001,7 @@
             <w:noProof/>
             <w:webHidden/>
           </w:rPr>
-          <w:instrText xml:space="preserve"> PAGEREF _Toc243423922 \h </w:instrText>
+          <w:instrText xml:space="preserve"> PAGEREF _Toc243424992 \h </w:instrText>
         </w:r>
         <w:r>
           <w:rPr>
@@ -3014,7 +3042,7 @@
           <w:noProof/>
         </w:rPr>
       </w:pPr>
-      <w:hyperlink w:anchor="_Toc243423923" w:history="1">
+      <w:hyperlink w:anchor="_Toc243424993" w:history="1">
         <w:r>
           <w:rPr>
             <w:rStyle w:val="Hyperlink"/>
@@ -3041,7 +3069,7 @@
             <w:noProof/>
             <w:webHidden/>
           </w:rPr>
-          <w:instrText xml:space="preserve"> PAGEREF _Toc243423923 \h </w:instrText>
+          <w:instrText xml:space="preserve"> PAGEREF _Toc243424993 \h </w:instrText>
         </w:r>
         <w:r>
           <w:rPr>
@@ -3082,7 +3110,7 @@
           <w:noProof/>
         </w:rPr>
       </w:pPr>
-      <w:hyperlink w:anchor="_Toc243423924" w:history="1">
+      <w:hyperlink w:anchor="_Toc243424994" w:history="1">
         <w:r>
           <w:rPr>
             <w:rStyle w:val="Hyperlink"/>
@@ -3109,7 +3137,7 @@
             <w:noProof/>
             <w:webHidden/>
           </w:rPr>
-          <w:instrText xml:space="preserve"> PAGEREF _Toc243423924 \h </w:instrText>
+          <w:instrText xml:space="preserve"> PAGEREF _Toc243424994 \h </w:instrText>
         </w:r>
         <w:r>
           <w:rPr>
@@ -3150,7 +3178,7 @@
           <w:noProof/>
         </w:rPr>
       </w:pPr>
-      <w:hyperlink w:anchor="_Toc243423925" w:history="1">
+      <w:hyperlink w:anchor="_Toc243424995" w:history="1">
         <w:r>
           <w:rPr>
             <w:rStyle w:val="Hyperlink"/>
@@ -3177,7 +3205,7 @@
             <w:noProof/>
             <w:webHidden/>
           </w:rPr>
-          <w:instrText xml:space="preserve"> PAGEREF _Toc243423925 \h </w:instrText>
+          <w:instrText xml:space="preserve"> PAGEREF _Toc243424995 \h </w:instrText>
         </w:r>
         <w:r>
           <w:rPr>
@@ -3218,7 +3246,7 @@
           <w:noProof/>
         </w:rPr>
       </w:pPr>
-      <w:hyperlink w:anchor="_Toc243423926" w:history="1">
+      <w:hyperlink w:anchor="_Toc243424996" w:history="1">
         <w:r>
           <w:rPr>
             <w:rStyle w:val="Hyperlink"/>
@@ -3245,7 +3273,7 @@
             <w:noProof/>
             <w:webHidden/>
           </w:rPr>
-          <w:instrText xml:space="preserve"> PAGEREF _Toc243423926 \h </w:instrText>
+          <w:instrText xml:space="preserve"> PAGEREF _Toc243424996 \h </w:instrText>
         </w:r>
         <w:r>
           <w:rPr>
@@ -3286,7 +3314,7 @@
           <w:noProof/>
         </w:rPr>
       </w:pPr>
-      <w:hyperlink w:anchor="_Toc243423927" w:history="1">
+      <w:hyperlink w:anchor="_Toc243424997" w:history="1">
         <w:r>
           <w:rPr>
             <w:rStyle w:val="Hyperlink"/>
@@ -3313,7 +3341,7 @@
             <w:noProof/>
             <w:webHidden/>
           </w:rPr>
-          <w:instrText xml:space="preserve"> PAGEREF _Toc243423927 \h </w:instrText>
+          <w:instrText xml:space="preserve"> PAGEREF _Toc243424997 \h </w:instrText>
         </w:r>
         <w:r>
           <w:rPr>
@@ -3354,7 +3382,7 @@
           <w:noProof/>
         </w:rPr>
       </w:pPr>
-      <w:hyperlink w:anchor="_Toc243423928" w:history="1">
+      <w:hyperlink w:anchor="_Toc243424998" w:history="1">
         <w:r>
           <w:rPr>
             <w:rStyle w:val="Hyperlink"/>
@@ -3381,7 +3409,7 @@
             <w:noProof/>
             <w:webHidden/>
           </w:rPr>
-          <w:instrText xml:space="preserve"> PAGEREF _Toc243423928 \h </w:instrText>
+          <w:instrText xml:space="preserve"> PAGEREF _Toc243424998 \h </w:instrText>
         </w:r>
         <w:r>
           <w:rPr>
@@ -3422,7 +3450,7 @@
           <w:noProof/>
         </w:rPr>
       </w:pPr>
-      <w:hyperlink w:anchor="_Toc243423929" w:history="1">
+      <w:hyperlink w:anchor="_Toc243424999" w:history="1">
         <w:r>
           <w:rPr>
             <w:rStyle w:val="Hyperlink"/>
@@ -3449,7 +3477,7 @@
             <w:noProof/>
             <w:webHidden/>
           </w:rPr>
-          <w:instrText xml:space="preserve"> PAGEREF _Toc243423929 \h </w:instrText>
+          <w:instrText xml:space="preserve"> PAGEREF _Toc243424999 \h </w:instrText>
         </w:r>
         <w:r>
           <w:rPr>
@@ -3490,7 +3518,7 @@
           <w:noProof/>
         </w:rPr>
       </w:pPr>
-      <w:hyperlink w:anchor="_Toc243423930" w:history="1">
+      <w:hyperlink w:anchor="_Toc243425000" w:history="1">
         <w:r>
           <w:rPr>
             <w:rStyle w:val="Hyperlink"/>
@@ -3517,7 +3545,7 @@
             <w:noProof/>
             <w:webHidden/>
           </w:rPr>
-          <w:instrText xml:space="preserve"> PAGEREF _Toc243423930 \h </w:instrText>
+          <w:instrText xml:space="preserve"> PAGEREF _Toc243425000 \h </w:instrText>
         </w:r>
         <w:r>
           <w:rPr>
@@ -3557,7 +3585,7 @@
       <w:pPr>
         <w:pStyle w:val="Heading1"/>
       </w:pPr>
-      <w:bookmarkStart w:id="2" w:name="_Toc243423886"/>
+      <w:bookmarkStart w:id="2" w:name="_Toc243424956"/>
       <w:r>
         <w:rPr>
           <w:rFonts w:ascii="Times New Roman" w:eastAsia="Times New Roman" w:hAnsi="Times New Roman"/>
@@ -3590,7 +3618,7 @@
       <w:pPr>
         <w:pStyle w:val="Heading1"/>
       </w:pPr>
-      <w:bookmarkStart w:id="3" w:name="_Toc243423887"/>
+      <w:bookmarkStart w:id="3" w:name="_Toc243424957"/>
       <w:r>
         <w:rPr>
           <w:rFonts w:ascii="Times New Roman" w:eastAsia="Times New Roman" w:hAnsi="Times New Roman"/>
@@ -3604,7 +3632,7 @@
       <w:pPr>
         <w:pStyle w:val="Heading2"/>
       </w:pPr>
-      <w:bookmarkStart w:id="4" w:name="_Toc243423888"/>
+      <w:bookmarkStart w:id="4" w:name="_Toc243424958"/>
       <w:r>
         <w:rPr>
           <w:rFonts w:ascii="Times New Roman" w:eastAsia="Times New Roman" w:hAnsi="Times New Roman"/>
@@ -3622,7 +3650,7 @@
       <w:pPr>
         <w:pStyle w:val="Heading2"/>
       </w:pPr>
-      <w:bookmarkStart w:id="5" w:name="_Toc243423889"/>
+      <w:bookmarkStart w:id="5" w:name="_Toc243424959"/>
       <w:r>
         <w:rPr>
           <w:rFonts w:ascii="Times New Roman" w:eastAsia="Times New Roman" w:hAnsi="Times New Roman"/>
@@ -3643,7 +3671,7 @@
       <w:pPr>
         <w:pStyle w:val="Heading2"/>
       </w:pPr>
-      <w:bookmarkStart w:id="6" w:name="_Toc243423890"/>
+      <w:bookmarkStart w:id="6" w:name="_Toc243424960"/>
       <w:r>
         <w:rPr>
           <w:rFonts w:ascii="Times New Roman" w:eastAsia="Times New Roman" w:hAnsi="Times New Roman"/>
@@ -3661,7 +3689,7 @@
       <w:pPr>
         <w:pStyle w:val="Heading2"/>
       </w:pPr>
-      <w:bookmarkStart w:id="7" w:name="_Toc243423891"/>
+      <w:bookmarkStart w:id="7" w:name="_Toc243424961"/>
       <w:r>
         <w:rPr>
           <w:rFonts w:ascii="Times New Roman" w:eastAsia="Times New Roman" w:hAnsi="Times New Roman"/>
@@ -3719,11 +3747,12 @@
       <w:pPr>
         <w:pStyle w:val="Heading2"/>
       </w:pPr>
-      <w:bookmarkStart w:id="8" w:name="_Toc243423892"/>
+      <w:bookmarkStart w:id="8" w:name="_Toc243424962"/>
       <w:r>
         <w:rPr>
           <w:rFonts w:ascii="Times New Roman" w:eastAsia="Times New Roman" w:hAnsi="Times New Roman"/>
         </w:rPr>
+        <w:lastRenderedPageBreak/>
         <w:t>1.5 Scope and Limitations</w:t>
       </w:r>
       <w:bookmarkEnd w:id="8"/>
@@ -3740,7 +3769,7 @@
       <w:pPr>
         <w:pStyle w:val="Heading2"/>
       </w:pPr>
-      <w:bookmarkStart w:id="9" w:name="_Toc243423893"/>
+      <w:bookmarkStart w:id="9" w:name="_Toc243424963"/>
       <w:r>
         <w:rPr>
           <w:rFonts w:ascii="Times New Roman" w:eastAsia="Times New Roman" w:hAnsi="Times New Roman"/>
@@ -3763,11 +3792,12 @@
       <w:pPr>
         <w:pStyle w:val="Heading1"/>
       </w:pPr>
-      <w:bookmarkStart w:id="10" w:name="_Toc243423894"/>
+      <w:bookmarkStart w:id="10" w:name="_Toc243424964"/>
       <w:r>
         <w:rPr>
           <w:rFonts w:ascii="Times New Roman" w:eastAsia="Times New Roman" w:hAnsi="Times New Roman"/>
         </w:rPr>
+        <w:lastRenderedPageBreak/>
         <w:t>CHAPTER 2: LITERATURE REVIEW / EXISTING SYSTEM</w:t>
       </w:r>
       <w:bookmarkEnd w:id="10"/>
@@ -3776,7 +3806,7 @@
       <w:pPr>
         <w:pStyle w:val="Heading2"/>
       </w:pPr>
-      <w:bookmarkStart w:id="11" w:name="_Toc243423895"/>
+      <w:bookmarkStart w:id="11" w:name="_Toc243424965"/>
       <w:r>
         <w:rPr>
           <w:rFonts w:ascii="Times New Roman" w:eastAsia="Times New Roman" w:hAnsi="Times New Roman"/>
@@ -3797,7 +3827,7 @@
       <w:pPr>
         <w:pStyle w:val="Heading2"/>
       </w:pPr>
-      <w:bookmarkStart w:id="12" w:name="_Toc243423896"/>
+      <w:bookmarkStart w:id="12" w:name="_Toc243424966"/>
       <w:r>
         <w:rPr>
           <w:rFonts w:ascii="Times New Roman" w:eastAsia="Times New Roman" w:hAnsi="Times New Roman"/>
@@ -3815,7 +3845,7 @@
       <w:pPr>
         <w:pStyle w:val="Heading2"/>
       </w:pPr>
-      <w:bookmarkStart w:id="13" w:name="_Toc243423897"/>
+      <w:bookmarkStart w:id="13" w:name="_Toc243424967"/>
       <w:r>
         <w:rPr>
           <w:rFonts w:ascii="Times New Roman" w:eastAsia="Times New Roman" w:hAnsi="Times New Roman"/>
@@ -4146,7 +4176,7 @@
       <w:pPr>
         <w:pStyle w:val="Heading2"/>
       </w:pPr>
-      <w:bookmarkStart w:id="14" w:name="_Toc243423898"/>
+      <w:bookmarkStart w:id="14" w:name="_Toc243424968"/>
       <w:r>
         <w:rPr>
           <w:rFonts w:ascii="Times New Roman" w:eastAsia="Times New Roman" w:hAnsi="Times New Roman"/>
@@ -4157,7 +4187,11 @@
     </w:p>
     <w:p>
       <w:r>
-        <w:t>The review supports a small pull-based design with Git as the control boundary. The project therefore keeps CI responsible for tests, image creation, and a configuration commit, while ArgoCD remains responsible for reading Git and applying the desired state. This separation is the basis for the proposed solution.</w:t>
+        <w:t xml:space="preserve">The review supports a small pull-based design with Git as the control boundary. The project therefore keeps CI responsible for tests, image creation, and a configuration commit, while </w:t>
+      </w:r>
+      <w:r>
+        <w:lastRenderedPageBreak/>
+        <w:t>ArgoCD remains responsible for reading Git and applying the desired state. This separation is the basis for the proposed solution.</w:t>
       </w:r>
     </w:p>
     <w:p>
@@ -4169,7 +4203,7 @@
       <w:pPr>
         <w:pStyle w:val="Heading1"/>
       </w:pPr>
-      <w:bookmarkStart w:id="15" w:name="_Toc243423899"/>
+      <w:bookmarkStart w:id="15" w:name="_Toc243424969"/>
       <w:r>
         <w:rPr>
           <w:rFonts w:ascii="Times New Roman" w:eastAsia="Times New Roman" w:hAnsi="Times New Roman"/>
@@ -4182,7 +4216,7 @@
       <w:pPr>
         <w:pStyle w:val="Heading2"/>
       </w:pPr>
-      <w:bookmarkStart w:id="16" w:name="_Toc243423900"/>
+      <w:bookmarkStart w:id="16" w:name="_Toc243424970"/>
       <w:r>
         <w:rPr>
           <w:rFonts w:ascii="Times New Roman" w:eastAsia="Times New Roman" w:hAnsi="Times New Roman"/>
@@ -4200,7 +4234,7 @@
       <w:pPr>
         <w:pStyle w:val="Heading2"/>
       </w:pPr>
-      <w:bookmarkStart w:id="17" w:name="_Toc243423901"/>
+      <w:bookmarkStart w:id="17" w:name="_Toc243424971"/>
       <w:r>
         <w:rPr>
           <w:rFonts w:ascii="Times New Roman" w:eastAsia="Times New Roman" w:hAnsi="Times New Roman"/>
@@ -4218,7 +4252,7 @@
       <w:pPr>
         <w:pStyle w:val="Heading2"/>
       </w:pPr>
-      <w:bookmarkStart w:id="18" w:name="_Toc243423902"/>
+      <w:bookmarkStart w:id="18" w:name="_Toc243424972"/>
       <w:r>
         <w:rPr>
           <w:rFonts w:ascii="Times New Roman" w:eastAsia="Times New Roman" w:hAnsi="Times New Roman"/>
@@ -4674,7 +4708,7 @@
       <w:pPr>
         <w:pStyle w:val="Heading2"/>
       </w:pPr>
-      <w:bookmarkStart w:id="19" w:name="_Toc243423903"/>
+      <w:bookmarkStart w:id="19" w:name="_Toc243424973"/>
       <w:r>
         <w:rPr>
           <w:rFonts w:ascii="Times New Roman" w:eastAsia="Times New Roman" w:hAnsi="Times New Roman"/>
@@ -5130,7 +5164,7 @@
       <w:pPr>
         <w:pStyle w:val="Heading2"/>
       </w:pPr>
-      <w:bookmarkStart w:id="20" w:name="_Toc243423904"/>
+      <w:bookmarkStart w:id="20" w:name="_Toc243424974"/>
       <w:r>
         <w:rPr>
           <w:rFonts w:ascii="Times New Roman" w:eastAsia="Times New Roman" w:hAnsi="Times New Roman"/>
@@ -5718,7 +5752,7 @@
       <w:pPr>
         <w:pStyle w:val="Heading2"/>
       </w:pPr>
-      <w:bookmarkStart w:id="21" w:name="_Toc243423905"/>
+      <w:bookmarkStart w:id="21" w:name="_Toc243424975"/>
       <w:r>
         <w:rPr>
           <w:rFonts w:ascii="Times New Roman" w:eastAsia="Times New Roman" w:hAnsi="Times New Roman"/>
@@ -6100,7 +6134,7 @@
       <w:pPr>
         <w:pStyle w:val="Heading1"/>
       </w:pPr>
-      <w:bookmarkStart w:id="22" w:name="_Toc243423906"/>
+      <w:bookmarkStart w:id="22" w:name="_Toc243424976"/>
       <w:r>
         <w:rPr>
           <w:rFonts w:ascii="Times New Roman" w:eastAsia="Times New Roman" w:hAnsi="Times New Roman"/>
@@ -6113,7 +6147,7 @@
       <w:pPr>
         <w:pStyle w:val="Heading2"/>
       </w:pPr>
-      <w:bookmarkStart w:id="23" w:name="_Toc243423907"/>
+      <w:bookmarkStart w:id="23" w:name="_Toc243424977"/>
       <w:r>
         <w:rPr>
           <w:rFonts w:ascii="Times New Roman" w:eastAsia="Times New Roman" w:hAnsi="Times New Roman"/>
@@ -6134,7 +6168,7 @@
       <w:pPr>
         <w:pStyle w:val="Heading2"/>
       </w:pPr>
-      <w:bookmarkStart w:id="24" w:name="_Toc243423908"/>
+      <w:bookmarkStart w:id="24" w:name="_Toc243424978"/>
       <w:r>
         <w:rPr>
           <w:rFonts w:ascii="Times New Roman" w:eastAsia="Times New Roman" w:hAnsi="Times New Roman"/>
@@ -6524,7 +6558,7 @@
       <w:pPr>
         <w:pStyle w:val="Heading2"/>
       </w:pPr>
-      <w:bookmarkStart w:id="25" w:name="_Toc243423909"/>
+      <w:bookmarkStart w:id="25" w:name="_Toc243424979"/>
       <w:r>
         <w:rPr>
           <w:rFonts w:ascii="Times New Roman" w:eastAsia="Times New Roman" w:hAnsi="Times New Roman"/>
@@ -6545,7 +6579,7 @@
       <w:pPr>
         <w:pStyle w:val="Heading2"/>
       </w:pPr>
-      <w:bookmarkStart w:id="26" w:name="_Toc243423910"/>
+      <w:bookmarkStart w:id="26" w:name="_Toc243424980"/>
       <w:r>
         <w:rPr>
           <w:rFonts w:ascii="Times New Roman" w:eastAsia="Times New Roman" w:hAnsi="Times New Roman"/>
@@ -6570,7 +6604,7 @@
           <w:noProof/>
         </w:rPr>
         <w:drawing>
-          <wp:inline distT="0" distB="0" distL="0" distR="0" wp14:anchorId="5BF89F20" wp14:editId="6BFD84EF">
+          <wp:inline distT="0" distB="0" distL="0" distR="0" wp14:anchorId="6E81F9EE" wp14:editId="0B5E0CEF">
             <wp:extent cx="6309360" cy="3001760"/>
             <wp:effectExtent l="0" t="0" r="0" b="0"/>
             <wp:docPr id="6" name="Picture 6"/>
@@ -6624,7 +6658,7 @@
       <w:pPr>
         <w:pStyle w:val="Heading2"/>
       </w:pPr>
-      <w:bookmarkStart w:id="27" w:name="_Toc243423911"/>
+      <w:bookmarkStart w:id="27" w:name="_Toc243424981"/>
       <w:r>
         <w:rPr>
           <w:rFonts w:ascii="Times New Roman" w:eastAsia="Times New Roman" w:hAnsi="Times New Roman"/>
@@ -6637,7 +6671,7 @@
       <w:pPr>
         <w:pStyle w:val="Heading2"/>
       </w:pPr>
-      <w:bookmarkStart w:id="28" w:name="_Toc243423912"/>
+      <w:bookmarkStart w:id="28" w:name="_Toc243424982"/>
       <w:r>
         <w:rPr>
           <w:rFonts w:ascii="Times New Roman" w:eastAsia="Times New Roman" w:hAnsi="Times New Roman"/>
@@ -6677,7 +6711,7 @@
       <w:pPr>
         <w:pStyle w:val="Heading2"/>
       </w:pPr>
-      <w:bookmarkStart w:id="29" w:name="_Toc243423913"/>
+      <w:bookmarkStart w:id="29" w:name="_Toc243424983"/>
       <w:r>
         <w:rPr>
           <w:rFonts w:ascii="Times New Roman" w:eastAsia="Times New Roman" w:hAnsi="Times New Roman"/>
@@ -6732,7 +6766,7 @@
           <w:noProof/>
         </w:rPr>
         <w:drawing>
-          <wp:inline distT="0" distB="0" distL="0" distR="0" wp14:anchorId="77E1BDC1" wp14:editId="2A399BE9">
+          <wp:inline distT="0" distB="0" distL="0" distR="0" wp14:anchorId="3222EED6" wp14:editId="0131628F">
             <wp:extent cx="5989320" cy="3743325"/>
             <wp:effectExtent l="0" t="0" r="0" b="0"/>
             <wp:docPr id="7" name="Picture 7"/>
@@ -6781,7 +6815,7 @@
       <w:pPr>
         <w:pStyle w:val="Heading2"/>
       </w:pPr>
-      <w:bookmarkStart w:id="30" w:name="_Toc243423914"/>
+      <w:bookmarkStart w:id="30" w:name="_Toc243424984"/>
       <w:r>
         <w:rPr>
           <w:rFonts w:ascii="Times New Roman" w:eastAsia="Times New Roman" w:hAnsi="Times New Roman"/>
@@ -6852,7 +6886,7 @@
           <w:noProof/>
         </w:rPr>
         <w:drawing>
-          <wp:inline distT="0" distB="0" distL="0" distR="0" wp14:anchorId="7F1F0ACA" wp14:editId="64EDDCB8">
+          <wp:inline distT="0" distB="0" distL="0" distR="0" wp14:anchorId="5E9EC11E" wp14:editId="0B638C72">
             <wp:extent cx="5989320" cy="3743325"/>
             <wp:effectExtent l="0" t="0" r="0" b="0"/>
             <wp:docPr id="8" name="Picture 8"/>
@@ -6901,7 +6935,7 @@
       <w:pPr>
         <w:pStyle w:val="Heading2"/>
       </w:pPr>
-      <w:bookmarkStart w:id="31" w:name="_Toc243423915"/>
+      <w:bookmarkStart w:id="31" w:name="_Toc243424985"/>
       <w:r>
         <w:rPr>
           <w:rFonts w:ascii="Times New Roman" w:eastAsia="Times New Roman" w:hAnsi="Times New Roman"/>
@@ -6964,7 +6998,7 @@
           <w:noProof/>
         </w:rPr>
         <w:drawing>
-          <wp:inline distT="0" distB="0" distL="0" distR="0" wp14:anchorId="14396A12" wp14:editId="79A6E53D">
+          <wp:inline distT="0" distB="0" distL="0" distR="0" wp14:anchorId="050FA99D" wp14:editId="44EAA85A">
             <wp:extent cx="5989320" cy="3743325"/>
             <wp:effectExtent l="0" t="0" r="0" b="0"/>
             <wp:docPr id="9" name="Picture 9"/>
@@ -7013,7 +7047,7 @@
       <w:pPr>
         <w:pStyle w:val="Heading2"/>
       </w:pPr>
-      <w:bookmarkStart w:id="32" w:name="_Toc243423916"/>
+      <w:bookmarkStart w:id="32" w:name="_Toc243424986"/>
       <w:r>
         <w:rPr>
           <w:rFonts w:ascii="Times New Roman" w:eastAsia="Times New Roman" w:hAnsi="Times New Roman"/>
@@ -7060,7 +7094,7 @@
           <w:noProof/>
         </w:rPr>
         <w:drawing>
-          <wp:inline distT="0" distB="0" distL="0" distR="0" wp14:anchorId="12B557EA" wp14:editId="51FA5E22">
+          <wp:inline distT="0" distB="0" distL="0" distR="0" wp14:anchorId="79496700" wp14:editId="100150D5">
             <wp:extent cx="6035040" cy="4191000"/>
             <wp:effectExtent l="0" t="0" r="0" b="0"/>
             <wp:docPr id="10" name="Picture 10"/>
@@ -7109,7 +7143,7 @@
       <w:pPr>
         <w:pStyle w:val="Heading2"/>
       </w:pPr>
-      <w:bookmarkStart w:id="33" w:name="_Toc243423917"/>
+      <w:bookmarkStart w:id="33" w:name="_Toc243424987"/>
       <w:r>
         <w:rPr>
           <w:rFonts w:ascii="Times New Roman" w:eastAsia="Times New Roman" w:hAnsi="Times New Roman"/>
@@ -7445,7 +7479,7 @@
       <w:pPr>
         <w:pStyle w:val="Heading1"/>
       </w:pPr>
-      <w:bookmarkStart w:id="34" w:name="_Toc243423918"/>
+      <w:bookmarkStart w:id="34" w:name="_Toc243424988"/>
       <w:r>
         <w:rPr>
           <w:rFonts w:ascii="Times New Roman" w:eastAsia="Times New Roman" w:hAnsi="Times New Roman"/>
@@ -7458,7 +7492,7 @@
       <w:pPr>
         <w:pStyle w:val="Heading2"/>
       </w:pPr>
-      <w:bookmarkStart w:id="35" w:name="_Toc243423919"/>
+      <w:bookmarkStart w:id="35" w:name="_Toc243424989"/>
       <w:r>
         <w:rPr>
           <w:rFonts w:ascii="Times New Roman" w:eastAsia="Times New Roman" w:hAnsi="Times New Roman"/>
@@ -8058,7 +8092,7 @@
           <w:noProof/>
         </w:rPr>
         <w:drawing>
-          <wp:inline distT="0" distB="0" distL="0" distR="0" wp14:anchorId="0CFA2C0D" wp14:editId="74789F33">
+          <wp:inline distT="0" distB="0" distL="0" distR="0" wp14:anchorId="1D86A92A" wp14:editId="5214630F">
             <wp:extent cx="5989320" cy="3743325"/>
             <wp:effectExtent l="0" t="0" r="0" b="0"/>
             <wp:docPr id="11" name="Picture 11"/>
@@ -8107,7 +8141,7 @@
       <w:pPr>
         <w:pStyle w:val="Heading2"/>
       </w:pPr>
-      <w:bookmarkStart w:id="36" w:name="_Toc243423920"/>
+      <w:bookmarkStart w:id="36" w:name="_Toc243424990"/>
       <w:r>
         <w:rPr>
           <w:rFonts w:ascii="Times New Roman" w:eastAsia="Times New Roman" w:hAnsi="Times New Roman"/>
@@ -8568,7 +8602,7 @@
       <w:pPr>
         <w:pStyle w:val="Heading2"/>
       </w:pPr>
-      <w:bookmarkStart w:id="37" w:name="_Toc243423921"/>
+      <w:bookmarkStart w:id="37" w:name="_Toc243424991"/>
       <w:r>
         <w:rPr>
           <w:rFonts w:ascii="Times New Roman" w:eastAsia="Times New Roman" w:hAnsi="Times New Roman"/>
@@ -8589,7 +8623,7 @@
       <w:pPr>
         <w:pStyle w:val="Heading2"/>
       </w:pPr>
-      <w:bookmarkStart w:id="38" w:name="_Toc243423922"/>
+      <w:bookmarkStart w:id="38" w:name="_Toc243424992"/>
       <w:r>
         <w:rPr>
           <w:rFonts w:ascii="Times New Roman" w:eastAsia="Times New Roman" w:hAnsi="Times New Roman"/>
@@ -8617,7 +8651,7 @@
           <w:noProof/>
         </w:rPr>
         <w:drawing>
-          <wp:inline distT="0" distB="0" distL="0" distR="0" wp14:anchorId="5280555F" wp14:editId="20580271">
+          <wp:inline distT="0" distB="0" distL="0" distR="0" wp14:anchorId="73291621" wp14:editId="0A42EE79">
             <wp:extent cx="5989320" cy="3166328"/>
             <wp:effectExtent l="0" t="0" r="0" b="0"/>
             <wp:docPr id="12" name="Picture 12"/>
@@ -8671,7 +8705,7 @@
       <w:pPr>
         <w:pStyle w:val="Heading1"/>
       </w:pPr>
-      <w:bookmarkStart w:id="39" w:name="_Toc243423923"/>
+      <w:bookmarkStart w:id="39" w:name="_Toc243424993"/>
       <w:r>
         <w:rPr>
           <w:rFonts w:ascii="Times New Roman" w:eastAsia="Times New Roman" w:hAnsi="Times New Roman"/>
@@ -8684,7 +8718,7 @@
       <w:pPr>
         <w:pStyle w:val="Heading2"/>
       </w:pPr>
-      <w:bookmarkStart w:id="40" w:name="_Toc243423924"/>
+      <w:bookmarkStart w:id="40" w:name="_Toc243424994"/>
       <w:r>
         <w:rPr>
           <w:rFonts w:ascii="Times New Roman" w:eastAsia="Times New Roman" w:hAnsi="Times New Roman"/>
@@ -8705,7 +8739,7 @@
       <w:pPr>
         <w:pStyle w:val="Heading2"/>
       </w:pPr>
-      <w:bookmarkStart w:id="41" w:name="_Toc243423925"/>
+      <w:bookmarkStart w:id="41" w:name="_Toc243424995"/>
       <w:r>
         <w:rPr>
           <w:rFonts w:ascii="Times New Roman" w:eastAsia="Times New Roman" w:hAnsi="Times New Roman"/>
@@ -8777,7 +8811,7 @@
       <w:pPr>
         <w:pStyle w:val="Heading1"/>
       </w:pPr>
-      <w:bookmarkStart w:id="42" w:name="_Toc243423926"/>
+      <w:bookmarkStart w:id="42" w:name="_Toc243424996"/>
       <w:r>
         <w:rPr>
           <w:rFonts w:ascii="Times New Roman" w:eastAsia="Times New Roman" w:hAnsi="Times New Roman"/>
@@ -8823,12 +8857,12 @@
     </w:p>
     <w:p>
       <w:r>
-        <w:t>[8] P. Das, "GitOps continuous deployment with ArgoCD," project repository, https://github.com/PDGamerSG/gitops-project, October 2026.</w:t>
-      </w:r>
-    </w:p>
-    <w:p>
-      <w:r>
-        <w:t>[9] P. Das, "GitOps project reference document," supplied ODT document, Research Paper folder, October 2026.</w:t>
+        <w:t>[8] P. Das and V. Kumar, "GitOps continuous deployment with ArgoCD," project repository, https://github.com/PDGamerSG/gitops-project, October 2026.</w:t>
+      </w:r>
+    </w:p>
+    <w:p>
+      <w:r>
+        <w:t>[9] P. Das and V. Kumar, "GitOps project reference document," supplied ODT document, Research Paper folder, October 2026.</w:t>
       </w:r>
     </w:p>
     <w:p>
@@ -8840,7 +8874,7 @@
       <w:pPr>
         <w:pStyle w:val="Heading1"/>
       </w:pPr>
-      <w:bookmarkStart w:id="43" w:name="_Toc243423927"/>
+      <w:bookmarkStart w:id="43" w:name="_Toc243424997"/>
       <w:r>
         <w:rPr>
           <w:rFonts w:ascii="Times New Roman" w:eastAsia="Times New Roman" w:hAnsi="Times New Roman"/>
@@ -8853,7 +8887,7 @@
       <w:pPr>
         <w:pStyle w:val="Heading2"/>
       </w:pPr>
-      <w:bookmarkStart w:id="44" w:name="_Toc243423928"/>
+      <w:bookmarkStart w:id="44" w:name="_Toc243424998"/>
       <w:r>
         <w:rPr>
           <w:rFonts w:ascii="Times New Roman" w:eastAsia="Times New Roman" w:hAnsi="Times New Roman"/>
@@ -8942,7 +8976,7 @@
       <w:pPr>
         <w:pStyle w:val="Heading2"/>
       </w:pPr>
-      <w:bookmarkStart w:id="45" w:name="_Toc243423929"/>
+      <w:bookmarkStart w:id="45" w:name="_Toc243424999"/>
       <w:r>
         <w:rPr>
           <w:rFonts w:ascii="Times New Roman" w:eastAsia="Times New Roman" w:hAnsi="Times New Roman"/>
@@ -9019,7 +9053,7 @@
       <w:pPr>
         <w:pStyle w:val="Heading2"/>
       </w:pPr>
-      <w:bookmarkStart w:id="46" w:name="_Toc243423930"/>
+      <w:bookmarkStart w:id="46" w:name="_Toc243425000"/>
       <w:r>
         <w:rPr>
           <w:rFonts w:ascii="Times New Roman" w:eastAsia="Times New Roman" w:hAnsi="Times New Roman"/>
@@ -9044,7 +9078,7 @@
           <w:noProof/>
         </w:rPr>
         <w:drawing>
-          <wp:inline distT="0" distB="0" distL="0" distR="0" wp14:anchorId="6B627639" wp14:editId="3B5E6C5B">
+          <wp:inline distT="0" distB="0" distL="0" distR="0" wp14:anchorId="44C33C72" wp14:editId="10F2CCDD">
             <wp:extent cx="6080760" cy="2145685"/>
             <wp:effectExtent l="0" t="0" r="0" b="0"/>
             <wp:docPr id="13" name="Picture 13"/>
@@ -9100,7 +9134,7 @@
           <w:noProof/>
         </w:rPr>
         <w:drawing>
-          <wp:inline distT="0" distB="0" distL="0" distR="0" wp14:anchorId="306FBE72" wp14:editId="49E9D7A8">
+          <wp:inline distT="0" distB="0" distL="0" distR="0" wp14:anchorId="4DA9FFE5" wp14:editId="0DCAC438">
             <wp:extent cx="6080760" cy="2893001"/>
             <wp:effectExtent l="0" t="0" r="0" b="0"/>
             <wp:docPr id="14" name="Picture 14"/>
@@ -9156,7 +9190,7 @@
           <w:noProof/>
         </w:rPr>
         <w:drawing>
-          <wp:inline distT="0" distB="0" distL="0" distR="0" wp14:anchorId="2B03235F" wp14:editId="3270B719">
+          <wp:inline distT="0" distB="0" distL="0" distR="0" wp14:anchorId="36D64B85" wp14:editId="561C097A">
             <wp:extent cx="6080760" cy="4247590"/>
             <wp:effectExtent l="0" t="0" r="0" b="0"/>
             <wp:docPr id="15" name="Picture 15"/>
@@ -9212,7 +9246,7 @@
           <w:noProof/>
         </w:rPr>
         <w:drawing>
-          <wp:inline distT="0" distB="0" distL="0" distR="0" wp14:anchorId="292D0DC7" wp14:editId="40766103">
+          <wp:inline distT="0" distB="0" distL="0" distR="0" wp14:anchorId="0CA47733" wp14:editId="1C7D85E5">
             <wp:extent cx="6080760" cy="2218519"/>
             <wp:effectExtent l="0" t="0" r="0" b="0"/>
             <wp:docPr id="16" name="Picture 16"/>
@@ -9268,7 +9302,7 @@
           <w:noProof/>
         </w:rPr>
         <w:drawing>
-          <wp:inline distT="0" distB="0" distL="0" distR="0" wp14:anchorId="18748224" wp14:editId="48B14E95">
+          <wp:inline distT="0" distB="0" distL="0" distR="0" wp14:anchorId="168655AC" wp14:editId="3A9152CB">
             <wp:extent cx="6080760" cy="1662708"/>
             <wp:effectExtent l="0" t="0" r="0" b="0"/>
             <wp:docPr id="17" name="Picture 17"/>
@@ -9324,7 +9358,7 @@
           <w:noProof/>
         </w:rPr>
         <w:drawing>
-          <wp:inline distT="0" distB="0" distL="0" distR="0" wp14:anchorId="55208A1C" wp14:editId="5C5F4829">
+          <wp:inline distT="0" distB="0" distL="0" distR="0" wp14:anchorId="74220F22" wp14:editId="59AB7FF0">
             <wp:extent cx="6080760" cy="3075621"/>
             <wp:effectExtent l="0" t="0" r="0" b="0"/>
             <wp:docPr id="18" name="Picture 18"/>
@@ -9380,7 +9414,7 @@
           <w:noProof/>
         </w:rPr>
         <w:drawing>
-          <wp:inline distT="0" distB="0" distL="0" distR="0" wp14:anchorId="4E602DA0" wp14:editId="5AC34012">
+          <wp:inline distT="0" distB="0" distL="0" distR="0" wp14:anchorId="23580C4E" wp14:editId="03DCD851">
             <wp:extent cx="6080760" cy="4012651"/>
             <wp:effectExtent l="0" t="0" r="0" b="0"/>
             <wp:docPr id="19" name="Picture 19"/>
@@ -9436,7 +9470,7 @@
           <w:noProof/>
         </w:rPr>
         <w:drawing>
-          <wp:inline distT="0" distB="0" distL="0" distR="0" wp14:anchorId="0F7DD06D" wp14:editId="68B1AFED">
+          <wp:inline distT="0" distB="0" distL="0" distR="0" wp14:anchorId="4A6355F2" wp14:editId="5FE4F96E">
             <wp:extent cx="6080760" cy="3214669"/>
             <wp:effectExtent l="0" t="0" r="0" b="0"/>
             <wp:docPr id="20" name="Picture 20"/>
@@ -9492,7 +9526,7 @@
           <w:noProof/>
         </w:rPr>
         <w:drawing>
-          <wp:inline distT="0" distB="0" distL="0" distR="0" wp14:anchorId="03B6F822" wp14:editId="1D59EC72">
+          <wp:inline distT="0" distB="0" distL="0" distR="0" wp14:anchorId="6E41ECF7" wp14:editId="722CB12B">
             <wp:extent cx="6080760" cy="2014710"/>
             <wp:effectExtent l="0" t="0" r="0" b="0"/>
             <wp:docPr id="21" name="Picture 21"/>
@@ -9830,31 +9864,31 @@
       </w:rPr>
     </w:lvl>
   </w:abstractNum>
-  <w:num w:numId="1" w16cid:durableId="1167358461">
+  <w:num w:numId="1" w16cid:durableId="1190559515">
     <w:abstractNumId w:val="8"/>
   </w:num>
-  <w:num w:numId="2" w16cid:durableId="1301572805">
+  <w:num w:numId="2" w16cid:durableId="650983101">
     <w:abstractNumId w:val="6"/>
   </w:num>
-  <w:num w:numId="3" w16cid:durableId="2045597402">
+  <w:num w:numId="3" w16cid:durableId="860583406">
     <w:abstractNumId w:val="5"/>
   </w:num>
-  <w:num w:numId="4" w16cid:durableId="2118595665">
+  <w:num w:numId="4" w16cid:durableId="1258557707">
     <w:abstractNumId w:val="4"/>
   </w:num>
-  <w:num w:numId="5" w16cid:durableId="300232267">
+  <w:num w:numId="5" w16cid:durableId="840047259">
     <w:abstractNumId w:val="7"/>
   </w:num>
-  <w:num w:numId="6" w16cid:durableId="1713189768">
+  <w:num w:numId="6" w16cid:durableId="1602643765">
     <w:abstractNumId w:val="3"/>
   </w:num>
-  <w:num w:numId="7" w16cid:durableId="939070352">
+  <w:num w:numId="7" w16cid:durableId="1756786180">
     <w:abstractNumId w:val="2"/>
   </w:num>
-  <w:num w:numId="8" w16cid:durableId="833494915">
+  <w:num w:numId="8" w16cid:durableId="1320619713">
     <w:abstractNumId w:val="1"/>
   </w:num>
-  <w:num w:numId="9" w16cid:durableId="966545460">
+  <w:num w:numId="9" w16cid:durableId="123426831">
     <w:abstractNumId w:val="0"/>
   </w:num>
 </w:numbering>
@@ -21253,7 +21287,7 @@
     <w:autoRedefine/>
     <w:uiPriority w:val="39"/>
     <w:unhideWhenUsed/>
-    <w:rsid w:val="00373178"/>
+    <w:rsid w:val="006A1759"/>
     <w:pPr>
       <w:spacing w:after="100"/>
     </w:pPr>
@@ -21265,7 +21299,7 @@
     <w:autoRedefine/>
     <w:uiPriority w:val="39"/>
     <w:unhideWhenUsed/>
-    <w:rsid w:val="00373178"/>
+    <w:rsid w:val="006A1759"/>
     <w:pPr>
       <w:spacing w:after="100"/>
       <w:ind w:left="240"/>
@@ -21276,7 +21310,7 @@
     <w:basedOn w:val="DefaultParagraphFont"/>
     <w:uiPriority w:val="99"/>
     <w:unhideWhenUsed/>
-    <w:rsid w:val="00373178"/>
+    <w:rsid w:val="006A1759"/>
     <w:rPr>
       <w:color w:val="0000FF" w:themeColor="hyperlink"/>
       <w:u w:val="single"/>

</xml_diff>